<commit_message>
D6 for Table 1 updated
</commit_message>
<xml_diff>
--- a/i_test/test_D6_Tabella_1_fasciaeta_2025/g_output/D6_Table_1_40-64.docx
+++ b/i_test/test_D6_Tabella_1_fasciaeta_2025/g_output/D6_Table_1_40-64.docx
@@ -51,6 +51,16 @@
             </w:r>
           </w:p>
         </w:tc>
+        <w:tc>
+          <w:p>
+            <w:pPr>
+              <w:pStyle w:val="Normal"/>
+            </w:pPr>
+            <w:r>
+              <w:t>Tutte</w:t>
+            </w:r>
+          </w:p>
+        </w:tc>
       </w:tr>
       <w:tr>
         <w:tc>
@@ -69,27 +79,37 @@
               <w:pStyle w:val="Normal"/>
             </w:pPr>
             <w:r>
-              <w:t>562</w:t>
-            </w:r>
-          </w:p>
-        </w:tc>
-        <w:tc>
-          <w:p>
-            <w:pPr>
-              <w:pStyle w:val="Normal"/>
-            </w:pPr>
-            <w:r>
-              <w:t>557</w:t>
-            </w:r>
-          </w:p>
-        </w:tc>
-        <w:tc>
-          <w:p>
-            <w:pPr>
-              <w:pStyle w:val="Normal"/>
-            </w:pPr>
-            <w:r>
-              <w:t>550</w:t>
+              <w:t>581</w:t>
+            </w:r>
+          </w:p>
+        </w:tc>
+        <w:tc>
+          <w:p>
+            <w:pPr>
+              <w:pStyle w:val="Normal"/>
+            </w:pPr>
+            <w:r>
+              <w:t>555</w:t>
+            </w:r>
+          </w:p>
+        </w:tc>
+        <w:tc>
+          <w:p>
+            <w:pPr>
+              <w:pStyle w:val="Normal"/>
+            </w:pPr>
+            <w:r>
+              <w:t>533</w:t>
+            </w:r>
+          </w:p>
+        </w:tc>
+        <w:tc>
+          <w:p>
+            <w:pPr>
+              <w:pStyle w:val="Normal"/>
+            </w:pPr>
+            <w:r>
+              <w:t>1669</w:t>
             </w:r>
           </w:p>
         </w:tc>
@@ -111,27 +131,37 @@
               <w:pStyle w:val="Normal"/>
             </w:pPr>
             <w:r>
-              <w:t>289 (51,4%)</w:t>
-            </w:r>
-          </w:p>
-        </w:tc>
-        <w:tc>
-          <w:p>
-            <w:pPr>
-              <w:pStyle w:val="Normal"/>
-            </w:pPr>
-            <w:r>
-              <w:t>278 (49,9%)</w:t>
-            </w:r>
-          </w:p>
-        </w:tc>
-        <w:tc>
-          <w:p>
-            <w:pPr>
-              <w:pStyle w:val="Normal"/>
-            </w:pPr>
-            <w:r>
-              <w:t>292 (53,1%)</w:t>
+              <w:t>296 (50,9%)</w:t>
+            </w:r>
+          </w:p>
+        </w:tc>
+        <w:tc>
+          <w:p>
+            <w:pPr>
+              <w:pStyle w:val="Normal"/>
+            </w:pPr>
+            <w:r>
+              <w:t>274 (49,4%)</w:t>
+            </w:r>
+          </w:p>
+        </w:tc>
+        <w:tc>
+          <w:p>
+            <w:pPr>
+              <w:pStyle w:val="Normal"/>
+            </w:pPr>
+            <w:r>
+              <w:t>289 (54,2%)</w:t>
+            </w:r>
+          </w:p>
+        </w:tc>
+        <w:tc>
+          <w:p>
+            <w:pPr>
+              <w:pStyle w:val="Normal"/>
+            </w:pPr>
+            <w:r>
+              <w:t>859 (51,5%)</w:t>
             </w:r>
           </w:p>
         </w:tc>
@@ -153,27 +183,37 @@
               <w:pStyle w:val="Normal"/>
             </w:pPr>
             <w:r>
-              <w:t>50 (8,9%)</w:t>
-            </w:r>
-          </w:p>
-        </w:tc>
-        <w:tc>
-          <w:p>
-            <w:pPr>
-              <w:pStyle w:val="Normal"/>
-            </w:pPr>
-            <w:r>
-              <w:t>51 (9,2%)</w:t>
-            </w:r>
-          </w:p>
-        </w:tc>
-        <w:tc>
-          <w:p>
-            <w:pPr>
-              <w:pStyle w:val="Normal"/>
-            </w:pPr>
-            <w:r>
-              <w:t>55 (10,0%)</w:t>
+              <w:t>42 (7,2%)</w:t>
+            </w:r>
+          </w:p>
+        </w:tc>
+        <w:tc>
+          <w:p>
+            <w:pPr>
+              <w:pStyle w:val="Normal"/>
+            </w:pPr>
+            <w:r>
+              <w:t>40 (7,2%)</w:t>
+            </w:r>
+          </w:p>
+        </w:tc>
+        <w:tc>
+          <w:p>
+            <w:pPr>
+              <w:pStyle w:val="Normal"/>
+            </w:pPr>
+            <w:r>
+              <w:t>46 (8,6%)</w:t>
+            </w:r>
+          </w:p>
+        </w:tc>
+        <w:tc>
+          <w:p>
+            <w:pPr>
+              <w:pStyle w:val="Normal"/>
+            </w:pPr>
+            <w:r>
+              <w:t>128 (7,7%)</w:t>
             </w:r>
           </w:p>
         </w:tc>
@@ -219,6 +259,16 @@
             </w:r>
           </w:p>
         </w:tc>
+        <w:tc>
+          <w:p>
+            <w:pPr>
+              <w:pStyle w:val="Normal"/>
+            </w:pPr>
+            <w:r>
+              <w:t/>
+            </w:r>
+          </w:p>
+        </w:tc>
       </w:tr>
       <w:tr>
         <w:tc>
@@ -227,37 +277,47 @@
               <w:pStyle w:val="Normal"/>
             </w:pPr>
             <w:r>
-              <w:t>A10BD09</w:t>
-            </w:r>
-          </w:p>
-        </w:tc>
-        <w:tc>
-          <w:p>
-            <w:pPr>
-              <w:pStyle w:val="Normal"/>
-            </w:pPr>
-            <w:r>
-              <w:t>183 (32,6%)</w:t>
-            </w:r>
-          </w:p>
-        </w:tc>
-        <w:tc>
-          <w:p>
-            <w:pPr>
-              <w:pStyle w:val="Normal"/>
-            </w:pPr>
-            <w:r>
-              <w:t>178 (32,0%)</w:t>
-            </w:r>
-          </w:p>
-        </w:tc>
-        <w:tc>
-          <w:p>
-            <w:pPr>
-              <w:pStyle w:val="Normal"/>
-            </w:pPr>
-            <w:r>
-              <w:t>169 (30,7%)</w:t>
+              <w:t>1</w:t>
+            </w:r>
+          </w:p>
+        </w:tc>
+        <w:tc>
+          <w:p>
+            <w:pPr>
+              <w:pStyle w:val="Normal"/>
+            </w:pPr>
+            <w:r>
+              <w:t>A10BH 226 (0,4%)</w:t>
+            </w:r>
+          </w:p>
+        </w:tc>
+        <w:tc>
+          <w:p>
+            <w:pPr>
+              <w:pStyle w:val="Normal"/>
+            </w:pPr>
+            <w:r>
+              <w:t>A10BD07 219 (0,4%)</w:t>
+            </w:r>
+          </w:p>
+        </w:tc>
+        <w:tc>
+          <w:p>
+            <w:pPr>
+              <w:pStyle w:val="Normal"/>
+            </w:pPr>
+            <w:r>
+              <w:t>A10BD09 202 (0,4%)</w:t>
+            </w:r>
+          </w:p>
+        </w:tc>
+        <w:tc>
+          <w:p>
+            <w:pPr>
+              <w:pStyle w:val="Normal"/>
+            </w:pPr>
+            <w:r>
+              <w:t>A10BD07 607 (0,4%)</w:t>
             </w:r>
           </w:p>
         </w:tc>
@@ -269,37 +329,47 @@
               <w:pStyle w:val="Normal"/>
             </w:pPr>
             <w:r>
-              <w:t>A10BK</w:t>
-            </w:r>
-          </w:p>
-        </w:tc>
-        <w:tc>
-          <w:p>
-            <w:pPr>
-              <w:pStyle w:val="Normal"/>
-            </w:pPr>
-            <w:r>
-              <w:t>198 (35,2%)</w:t>
-            </w:r>
-          </w:p>
-        </w:tc>
-        <w:tc>
-          <w:p>
-            <w:pPr>
-              <w:pStyle w:val="Normal"/>
-            </w:pPr>
-            <w:r>
-              <w:t>161 (28,9%)</w:t>
-            </w:r>
-          </w:p>
-        </w:tc>
-        <w:tc>
-          <w:p>
-            <w:pPr>
-              <w:pStyle w:val="Normal"/>
-            </w:pPr>
-            <w:r>
-              <w:t>158 (28,7%)</w:t>
+              <w:t>2</w:t>
+            </w:r>
+          </w:p>
+        </w:tc>
+        <w:tc>
+          <w:p>
+            <w:pPr>
+              <w:pStyle w:val="Normal"/>
+            </w:pPr>
+            <w:r>
+              <w:t>A10BD07 218 (0,4%)</w:t>
+            </w:r>
+          </w:p>
+        </w:tc>
+        <w:tc>
+          <w:p>
+            <w:pPr>
+              <w:pStyle w:val="Normal"/>
+            </w:pPr>
+            <w:r>
+              <w:t>A10AE56 212 (0,4%)</w:t>
+            </w:r>
+          </w:p>
+        </w:tc>
+        <w:tc>
+          <w:p>
+            <w:pPr>
+              <w:pStyle w:val="Normal"/>
+            </w:pPr>
+            <w:r>
+              <w:t>A10AE54 200 (0,4%)</w:t>
+            </w:r>
+          </w:p>
+        </w:tc>
+        <w:tc>
+          <w:p>
+            <w:pPr>
+              <w:pStyle w:val="Normal"/>
+            </w:pPr>
+            <w:r>
+              <w:t>A10BD10 603 (0,4%)</w:t>
             </w:r>
           </w:p>
         </w:tc>
@@ -311,37 +381,47 @@
               <w:pStyle w:val="Normal"/>
             </w:pPr>
             <w:r>
-              <w:t>A10BD24</w:t>
-            </w:r>
-          </w:p>
-        </w:tc>
-        <w:tc>
-          <w:p>
-            <w:pPr>
-              <w:pStyle w:val="Normal"/>
-            </w:pPr>
-            <w:r>
-              <w:t>178 (31,7%)</w:t>
-            </w:r>
-          </w:p>
-        </w:tc>
-        <w:tc>
-          <w:p>
-            <w:pPr>
-              <w:pStyle w:val="Normal"/>
-            </w:pPr>
-            <w:r>
-              <w:t>176 (31,6%)</w:t>
-            </w:r>
-          </w:p>
-        </w:tc>
-        <w:tc>
-          <w:p>
-            <w:pPr>
-              <w:pStyle w:val="Normal"/>
-            </w:pPr>
-            <w:r>
-              <w:t>160 (29,1%)</w:t>
+              <w:t>3</w:t>
+            </w:r>
+          </w:p>
+        </w:tc>
+        <w:tc>
+          <w:p>
+            <w:pPr>
+              <w:pStyle w:val="Normal"/>
+            </w:pPr>
+            <w:r>
+              <w:t>A10BD24 214 (0,4%)</w:t>
+            </w:r>
+          </w:p>
+        </w:tc>
+        <w:tc>
+          <w:p>
+            <w:pPr>
+              <w:pStyle w:val="Normal"/>
+            </w:pPr>
+            <w:r>
+              <w:t>A10AE54 209 (0,4%)</w:t>
+            </w:r>
+          </w:p>
+        </w:tc>
+        <w:tc>
+          <w:p>
+            <w:pPr>
+              <w:pStyle w:val="Normal"/>
+            </w:pPr>
+            <w:r>
+              <w:t>A10BD10 198 (0,4%)</w:t>
+            </w:r>
+          </w:p>
+        </w:tc>
+        <w:tc>
+          <w:p>
+            <w:pPr>
+              <w:pStyle w:val="Normal"/>
+            </w:pPr>
+            <w:r>
+              <w:t>A10BD09 597 (0,4%)</w:t>
             </w:r>
           </w:p>
         </w:tc>
@@ -353,37 +433,47 @@
               <w:pStyle w:val="Normal"/>
             </w:pPr>
             <w:r>
-              <w:t>A10BJ</w:t>
-            </w:r>
-          </w:p>
-        </w:tc>
-        <w:tc>
-          <w:p>
-            <w:pPr>
-              <w:pStyle w:val="Normal"/>
-            </w:pPr>
-            <w:r>
-              <w:t>170 (30,2%)</w:t>
-            </w:r>
-          </w:p>
-        </w:tc>
-        <w:tc>
-          <w:p>
-            <w:pPr>
-              <w:pStyle w:val="Normal"/>
-            </w:pPr>
-            <w:r>
-              <w:t>170 (30,5%)</w:t>
-            </w:r>
-          </w:p>
-        </w:tc>
-        <w:tc>
-          <w:p>
-            <w:pPr>
-              <w:pStyle w:val="Normal"/>
-            </w:pPr>
-            <w:r>
-              <w:t>157 (28,5%)</w:t>
+              <w:t>4</w:t>
+            </w:r>
+          </w:p>
+        </w:tc>
+        <w:tc>
+          <w:p>
+            <w:pPr>
+              <w:pStyle w:val="Normal"/>
+            </w:pPr>
+            <w:r>
+              <w:t>A10BD10 212 (0,4%)</w:t>
+            </w:r>
+          </w:p>
+        </w:tc>
+        <w:tc>
+          <w:p>
+            <w:pPr>
+              <w:pStyle w:val="Normal"/>
+            </w:pPr>
+            <w:r>
+              <w:t>A10BD20 204 (0,4%)</w:t>
+            </w:r>
+          </w:p>
+        </w:tc>
+        <w:tc>
+          <w:p>
+            <w:pPr>
+              <w:pStyle w:val="Normal"/>
+            </w:pPr>
+            <w:r>
+              <w:t>A10BD13 195 (0,4%)</w:t>
+            </w:r>
+          </w:p>
+        </w:tc>
+        <w:tc>
+          <w:p>
+            <w:pPr>
+              <w:pStyle w:val="Normal"/>
+            </w:pPr>
+            <w:r>
+              <w:t>A10AE54 592 (0,4%)</w:t>
             </w:r>
           </w:p>
         </w:tc>
@@ -395,37 +485,47 @@
               <w:pStyle w:val="Normal"/>
             </w:pPr>
             <w:r>
-              <w:t>A10BH</w:t>
-            </w:r>
-          </w:p>
-        </w:tc>
-        <w:tc>
-          <w:p>
-            <w:pPr>
-              <w:pStyle w:val="Normal"/>
-            </w:pPr>
-            <w:r>
-              <w:t>169 (30,1%)</w:t>
-            </w:r>
-          </w:p>
-        </w:tc>
-        <w:tc>
-          <w:p>
-            <w:pPr>
-              <w:pStyle w:val="Normal"/>
-            </w:pPr>
-            <w:r>
-              <w:t>173 (31,1%)</w:t>
-            </w:r>
-          </w:p>
-        </w:tc>
-        <w:tc>
-          <w:p>
-            <w:pPr>
-              <w:pStyle w:val="Normal"/>
-            </w:pPr>
-            <w:r>
-              <w:t>154 (28,0%)</w:t>
+              <w:t>5</w:t>
+            </w:r>
+          </w:p>
+        </w:tc>
+        <w:tc>
+          <w:p>
+            <w:pPr>
+              <w:pStyle w:val="Normal"/>
+            </w:pPr>
+            <w:r>
+              <w:t>A10AE56 208 (0,4%)</w:t>
+            </w:r>
+          </w:p>
+        </w:tc>
+        <w:tc>
+          <w:p>
+            <w:pPr>
+              <w:pStyle w:val="Normal"/>
+            </w:pPr>
+            <w:r>
+              <w:t>A10BJ 203 (0,4%)</w:t>
+            </w:r>
+          </w:p>
+        </w:tc>
+        <w:tc>
+          <w:p>
+            <w:pPr>
+              <w:pStyle w:val="Normal"/>
+            </w:pPr>
+            <w:r>
+              <w:t>A10BX16 194 (0,4%)</w:t>
+            </w:r>
+          </w:p>
+        </w:tc>
+        <w:tc>
+          <w:p>
+            <w:pPr>
+              <w:pStyle w:val="Normal"/>
+            </w:pPr>
+            <w:r>
+              <w:t>A10BH 590 (0,4%)</w:t>
             </w:r>
           </w:p>
         </w:tc>
@@ -471,6 +571,16 @@
             </w:r>
           </w:p>
         </w:tc>
+        <w:tc>
+          <w:p>
+            <w:pPr>
+              <w:pStyle w:val="Normal"/>
+            </w:pPr>
+            <w:r>
+              <w:t/>
+            </w:r>
+          </w:p>
+        </w:tc>
       </w:tr>
       <w:tr>
         <w:tc>
@@ -489,27 +599,37 @@
               <w:pStyle w:val="Normal"/>
             </w:pPr>
             <w:r>
-              <w:t>258 (45,9%)</w:t>
-            </w:r>
-          </w:p>
-        </w:tc>
-        <w:tc>
-          <w:p>
-            <w:pPr>
-              <w:pStyle w:val="Normal"/>
-            </w:pPr>
-            <w:r>
-              <w:t>254 (45,6%)</w:t>
-            </w:r>
-          </w:p>
-        </w:tc>
-        <w:tc>
-          <w:p>
-            <w:pPr>
-              <w:pStyle w:val="Normal"/>
-            </w:pPr>
-            <w:r>
-              <w:t>283 (51,5%)</w:t>
+              <w:t>3 (0,5%)</w:t>
+            </w:r>
+          </w:p>
+        </w:tc>
+        <w:tc>
+          <w:p>
+            <w:pPr>
+              <w:pStyle w:val="Normal"/>
+            </w:pPr>
+            <w:r>
+              <w:t>5 (0,9%)</w:t>
+            </w:r>
+          </w:p>
+        </w:tc>
+        <w:tc>
+          <w:p>
+            <w:pPr>
+              <w:pStyle w:val="Normal"/>
+            </w:pPr>
+            <w:r>
+              <w:t>5 (0,9%)</w:t>
+            </w:r>
+          </w:p>
+        </w:tc>
+        <w:tc>
+          <w:p>
+            <w:pPr>
+              <w:pStyle w:val="Normal"/>
+            </w:pPr>
+            <w:r>
+              <w:t>13 (0,8%)</w:t>
             </w:r>
           </w:p>
         </w:tc>
@@ -555,6 +675,16 @@
             </w:r>
           </w:p>
         </w:tc>
+        <w:tc>
+          <w:p>
+            <w:pPr>
+              <w:pStyle w:val="Normal"/>
+            </w:pPr>
+            <w:r>
+              <w:t/>
+            </w:r>
+          </w:p>
+        </w:tc>
       </w:tr>
       <w:tr>
         <w:tc>
@@ -573,27 +703,37 @@
               <w:pStyle w:val="Normal"/>
             </w:pPr>
             <w:r>
-              <w:t>400 (71,2%)</w:t>
-            </w:r>
-          </w:p>
-        </w:tc>
-        <w:tc>
-          <w:p>
-            <w:pPr>
-              <w:pStyle w:val="Normal"/>
-            </w:pPr>
-            <w:r>
-              <w:t>376 (67,5%)</w:t>
-            </w:r>
-          </w:p>
-        </w:tc>
-        <w:tc>
-          <w:p>
-            <w:pPr>
-              <w:pStyle w:val="Normal"/>
-            </w:pPr>
-            <w:r>
-              <w:t>381 (69,3%)</w:t>
+              <w:t>367 (63,2%)</w:t>
+            </w:r>
+          </w:p>
+        </w:tc>
+        <w:tc>
+          <w:p>
+            <w:pPr>
+              <w:pStyle w:val="Normal"/>
+            </w:pPr>
+            <w:r>
+              <w:t>357 (64,3%)</w:t>
+            </w:r>
+          </w:p>
+        </w:tc>
+        <w:tc>
+          <w:p>
+            <w:pPr>
+              <w:pStyle w:val="Normal"/>
+            </w:pPr>
+            <w:r>
+              <w:t>339 (63,6%)</w:t>
+            </w:r>
+          </w:p>
+        </w:tc>
+        <w:tc>
+          <w:p>
+            <w:pPr>
+              <w:pStyle w:val="Normal"/>
+            </w:pPr>
+            <w:r>
+              <w:t>1.063 (63,7%)</w:t>
             </w:r>
           </w:p>
         </w:tc>
@@ -615,27 +755,37 @@
               <w:pStyle w:val="Normal"/>
             </w:pPr>
             <w:r>
-              <w:t>394 (70,1%)</w:t>
-            </w:r>
-          </w:p>
-        </w:tc>
-        <w:tc>
-          <w:p>
-            <w:pPr>
-              <w:pStyle w:val="Normal"/>
-            </w:pPr>
-            <w:r>
-              <w:t>358 (64,3%)</w:t>
-            </w:r>
-          </w:p>
-        </w:tc>
-        <w:tc>
-          <w:p>
-            <w:pPr>
-              <w:pStyle w:val="Normal"/>
-            </w:pPr>
-            <w:r>
-              <w:t>361 (65,6%)</w:t>
+              <w:t>61 (10,5%)</w:t>
+            </w:r>
+          </w:p>
+        </w:tc>
+        <w:tc>
+          <w:p>
+            <w:pPr>
+              <w:pStyle w:val="Normal"/>
+            </w:pPr>
+            <w:r>
+              <w:t>45 (8,1%)</w:t>
+            </w:r>
+          </w:p>
+        </w:tc>
+        <w:tc>
+          <w:p>
+            <w:pPr>
+              <w:pStyle w:val="Normal"/>
+            </w:pPr>
+            <w:r>
+              <w:t>63 (11,8%)</w:t>
+            </w:r>
+          </w:p>
+        </w:tc>
+        <w:tc>
+          <w:p>
+            <w:pPr>
+              <w:pStyle w:val="Normal"/>
+            </w:pPr>
+            <w:r>
+              <w:t>169 (10,1%)</w:t>
             </w:r>
           </w:p>
         </w:tc>
@@ -657,27 +807,37 @@
               <w:pStyle w:val="Normal"/>
             </w:pPr>
             <w:r>
-              <w:t>132 (23,5%)</w:t>
-            </w:r>
-          </w:p>
-        </w:tc>
-        <w:tc>
-          <w:p>
-            <w:pPr>
-              <w:pStyle w:val="Normal"/>
-            </w:pPr>
-            <w:r>
-              <w:t>119 (21,4%)</w:t>
-            </w:r>
-          </w:p>
-        </w:tc>
-        <w:tc>
-          <w:p>
-            <w:pPr>
-              <w:pStyle w:val="Normal"/>
-            </w:pPr>
-            <w:r>
-              <w:t>125 (22,7%)</w:t>
+              <w:t>370 (63,7%)</w:t>
+            </w:r>
+          </w:p>
+        </w:tc>
+        <w:tc>
+          <w:p>
+            <w:pPr>
+              <w:pStyle w:val="Normal"/>
+            </w:pPr>
+            <w:r>
+              <w:t>353 (63,6%)</w:t>
+            </w:r>
+          </w:p>
+        </w:tc>
+        <w:tc>
+          <w:p>
+            <w:pPr>
+              <w:pStyle w:val="Normal"/>
+            </w:pPr>
+            <w:r>
+              <w:t>352 (66,0%)</w:t>
+            </w:r>
+          </w:p>
+        </w:tc>
+        <w:tc>
+          <w:p>
+            <w:pPr>
+              <w:pStyle w:val="Normal"/>
+            </w:pPr>
+            <w:r>
+              <w:t>1.075 (64,4%)</w:t>
             </w:r>
           </w:p>
         </w:tc>
@@ -699,27 +859,37 @@
               <w:pStyle w:val="Normal"/>
             </w:pPr>
             <w:r>
-              <w:t>321 (57,1%)</w:t>
-            </w:r>
-          </w:p>
-        </w:tc>
-        <w:tc>
-          <w:p>
-            <w:pPr>
-              <w:pStyle w:val="Normal"/>
-            </w:pPr>
-            <w:r>
-              <w:t>308 (55,3%)</w:t>
-            </w:r>
-          </w:p>
-        </w:tc>
-        <w:tc>
-          <w:p>
-            <w:pPr>
-              <w:pStyle w:val="Normal"/>
-            </w:pPr>
-            <w:r>
-              <w:t>321 (58,4%)</w:t>
+              <w:t>268 (46,1%)</w:t>
+            </w:r>
+          </w:p>
+        </w:tc>
+        <w:tc>
+          <w:p>
+            <w:pPr>
+              <w:pStyle w:val="Normal"/>
+            </w:pPr>
+            <w:r>
+              <w:t>233 (42,0%)</w:t>
+            </w:r>
+          </w:p>
+        </w:tc>
+        <w:tc>
+          <w:p>
+            <w:pPr>
+              <w:pStyle w:val="Normal"/>
+            </w:pPr>
+            <w:r>
+              <w:t>226 (42,4%)</w:t>
+            </w:r>
+          </w:p>
+        </w:tc>
+        <w:tc>
+          <w:p>
+            <w:pPr>
+              <w:pStyle w:val="Normal"/>
+            </w:pPr>
+            <w:r>
+              <w:t>727 (43,6%)</w:t>
             </w:r>
           </w:p>
         </w:tc>

</xml_diff>

<commit_message>
dataset including description of drugs simulated and D5 for Table 1 modified having description instead of ATC codes
</commit_message>
<xml_diff>
--- a/i_test/test_D6_Tabella_1_fasciaeta_2025/g_output/D6_Table_1_40-64.docx
+++ b/i_test/test_D6_Tabella_1_fasciaeta_2025/g_output/D6_Table_1_40-64.docx
@@ -287,37 +287,37 @@
               <w:pStyle w:val="Normal"/>
             </w:pPr>
             <w:r>
-              <w:t>A10BH 226 (0,4%)</w:t>
-            </w:r>
-          </w:p>
-        </w:tc>
-        <w:tc>
-          <w:p>
-            <w:pPr>
-              <w:pStyle w:val="Normal"/>
-            </w:pPr>
-            <w:r>
-              <w:t>A10BD07 219 (0,4%)</w:t>
-            </w:r>
-          </w:p>
-        </w:tc>
-        <w:tc>
-          <w:p>
-            <w:pPr>
-              <w:pStyle w:val="Normal"/>
-            </w:pPr>
-            <w:r>
-              <w:t>A10BD09 202 (0,4%)</w:t>
-            </w:r>
-          </w:p>
-        </w:tc>
-        <w:tc>
-          <w:p>
-            <w:pPr>
-              <w:pStyle w:val="Normal"/>
-            </w:pPr>
-            <w:r>
-              <w:t>A10BD07 607 (0,4%)</w:t>
+              <w:t>NA 226 (38,9%)</w:t>
+            </w:r>
+          </w:p>
+        </w:tc>
+        <w:tc>
+          <w:p>
+            <w:pPr>
+              <w:pStyle w:val="Normal"/>
+            </w:pPr>
+            <w:r>
+              <w:t>kk 219 (39,5%)</w:t>
+            </w:r>
+          </w:p>
+        </w:tc>
+        <w:tc>
+          <w:p>
+            <w:pPr>
+              <w:pStyle w:val="Normal"/>
+            </w:pPr>
+            <w:r>
+              <w:t>mm 202 (37,9%)</w:t>
+            </w:r>
+          </w:p>
+        </w:tc>
+        <w:tc>
+          <w:p>
+            <w:pPr>
+              <w:pStyle w:val="Normal"/>
+            </w:pPr>
+            <w:r>
+              <w:t>kk 607 (36,4%)</w:t>
             </w:r>
           </w:p>
         </w:tc>
@@ -339,37 +339,37 @@
               <w:pStyle w:val="Normal"/>
             </w:pPr>
             <w:r>
-              <w:t>A10BD07 218 (0,4%)</w:t>
-            </w:r>
-          </w:p>
-        </w:tc>
-        <w:tc>
-          <w:p>
-            <w:pPr>
-              <w:pStyle w:val="Normal"/>
-            </w:pPr>
-            <w:r>
-              <w:t>A10AE56 212 (0,4%)</w:t>
-            </w:r>
-          </w:p>
-        </w:tc>
-        <w:tc>
-          <w:p>
-            <w:pPr>
-              <w:pStyle w:val="Normal"/>
-            </w:pPr>
-            <w:r>
-              <w:t>A10AE54 200 (0,4%)</w:t>
-            </w:r>
-          </w:p>
-        </w:tc>
-        <w:tc>
-          <w:p>
-            <w:pPr>
-              <w:pStyle w:val="Normal"/>
-            </w:pPr>
-            <w:r>
-              <w:t>A10BD10 603 (0,4%)</w:t>
+              <w:t>kk 218 (37,5%)</w:t>
+            </w:r>
+          </w:p>
+        </w:tc>
+        <w:tc>
+          <w:p>
+            <w:pPr>
+              <w:pStyle w:val="Normal"/>
+            </w:pPr>
+            <w:r>
+              <w:t>nn 212 (38,2%)</w:t>
+            </w:r>
+          </w:p>
+        </w:tc>
+        <w:tc>
+          <w:p>
+            <w:pPr>
+              <w:pStyle w:val="Normal"/>
+            </w:pPr>
+            <w:r>
+              <w:t>oo 200 (37,5%)</w:t>
+            </w:r>
+          </w:p>
+        </w:tc>
+        <w:tc>
+          <w:p>
+            <w:pPr>
+              <w:pStyle w:val="Normal"/>
+            </w:pPr>
+            <w:r>
+              <w:t>jj 603 (36,1%)</w:t>
             </w:r>
           </w:p>
         </w:tc>
@@ -391,37 +391,37 @@
               <w:pStyle w:val="Normal"/>
             </w:pPr>
             <w:r>
-              <w:t>A10BD24 214 (0,4%)</w:t>
-            </w:r>
-          </w:p>
-        </w:tc>
-        <w:tc>
-          <w:p>
-            <w:pPr>
-              <w:pStyle w:val="Normal"/>
-            </w:pPr>
-            <w:r>
-              <w:t>A10AE54 209 (0,4%)</w:t>
-            </w:r>
-          </w:p>
-        </w:tc>
-        <w:tc>
-          <w:p>
-            <w:pPr>
-              <w:pStyle w:val="Normal"/>
-            </w:pPr>
-            <w:r>
-              <w:t>A10BD10 198 (0,4%)</w:t>
-            </w:r>
-          </w:p>
-        </w:tc>
-        <w:tc>
-          <w:p>
-            <w:pPr>
-              <w:pStyle w:val="Normal"/>
-            </w:pPr>
-            <w:r>
-              <w:t>A10BD09 597 (0,4%)</w:t>
+              <w:t>ee 214 (36,8%)</w:t>
+            </w:r>
+          </w:p>
+        </w:tc>
+        <w:tc>
+          <w:p>
+            <w:pPr>
+              <w:pStyle w:val="Normal"/>
+            </w:pPr>
+            <w:r>
+              <w:t>oo 209 (37,7%)</w:t>
+            </w:r>
+          </w:p>
+        </w:tc>
+        <w:tc>
+          <w:p>
+            <w:pPr>
+              <w:pStyle w:val="Normal"/>
+            </w:pPr>
+            <w:r>
+              <w:t>jj 198 (37,1%)</w:t>
+            </w:r>
+          </w:p>
+        </w:tc>
+        <w:tc>
+          <w:p>
+            <w:pPr>
+              <w:pStyle w:val="Normal"/>
+            </w:pPr>
+            <w:r>
+              <w:t>mm 597 (35,8%)</w:t>
             </w:r>
           </w:p>
         </w:tc>
@@ -443,37 +443,37 @@
               <w:pStyle w:val="Normal"/>
             </w:pPr>
             <w:r>
-              <w:t>A10BD10 212 (0,4%)</w:t>
-            </w:r>
-          </w:p>
-        </w:tc>
-        <w:tc>
-          <w:p>
-            <w:pPr>
-              <w:pStyle w:val="Normal"/>
-            </w:pPr>
-            <w:r>
-              <w:t>A10BD20 204 (0,4%)</w:t>
-            </w:r>
-          </w:p>
-        </w:tc>
-        <w:tc>
-          <w:p>
-            <w:pPr>
-              <w:pStyle w:val="Normal"/>
-            </w:pPr>
-            <w:r>
-              <w:t>A10BD13 195 (0,4%)</w:t>
-            </w:r>
-          </w:p>
-        </w:tc>
-        <w:tc>
-          <w:p>
-            <w:pPr>
-              <w:pStyle w:val="Normal"/>
-            </w:pPr>
-            <w:r>
-              <w:t>A10AE54 592 (0,4%)</w:t>
+              <w:t>jj 212 (36,5%)</w:t>
+            </w:r>
+          </w:p>
+        </w:tc>
+        <w:tc>
+          <w:p>
+            <w:pPr>
+              <w:pStyle w:val="Normal"/>
+            </w:pPr>
+            <w:r>
+              <w:t>rr 204 (36,8%)</w:t>
+            </w:r>
+          </w:p>
+        </w:tc>
+        <w:tc>
+          <w:p>
+            <w:pPr>
+              <w:pStyle w:val="Normal"/>
+            </w:pPr>
+            <w:r>
+              <w:t>hh 195 (36,6%)</w:t>
+            </w:r>
+          </w:p>
+        </w:tc>
+        <w:tc>
+          <w:p>
+            <w:pPr>
+              <w:pStyle w:val="Normal"/>
+            </w:pPr>
+            <w:r>
+              <w:t>oo 592 (35,5%)</w:t>
             </w:r>
           </w:p>
         </w:tc>
@@ -495,37 +495,37 @@
               <w:pStyle w:val="Normal"/>
             </w:pPr>
             <w:r>
-              <w:t>A10AE56 208 (0,4%)</w:t>
-            </w:r>
-          </w:p>
-        </w:tc>
-        <w:tc>
-          <w:p>
-            <w:pPr>
-              <w:pStyle w:val="Normal"/>
-            </w:pPr>
-            <w:r>
-              <w:t>A10BJ 203 (0,4%)</w:t>
-            </w:r>
-          </w:p>
-        </w:tc>
-        <w:tc>
-          <w:p>
-            <w:pPr>
-              <w:pStyle w:val="Normal"/>
-            </w:pPr>
-            <w:r>
-              <w:t>A10BX16 194 (0,4%)</w:t>
-            </w:r>
-          </w:p>
-        </w:tc>
-        <w:tc>
-          <w:p>
-            <w:pPr>
-              <w:pStyle w:val="Normal"/>
-            </w:pPr>
-            <w:r>
-              <w:t>A10BH 590 (0,4%)</w:t>
+              <w:t>nn 208 (35,8%)</w:t>
+            </w:r>
+          </w:p>
+        </w:tc>
+        <w:tc>
+          <w:p>
+            <w:pPr>
+              <w:pStyle w:val="Normal"/>
+            </w:pPr>
+            <w:r>
+              <w:t>NA 203 (36,6%)</w:t>
+            </w:r>
+          </w:p>
+        </w:tc>
+        <w:tc>
+          <w:p>
+            <w:pPr>
+              <w:pStyle w:val="Normal"/>
+            </w:pPr>
+            <w:r>
+              <w:t>cc 194 (36,4%)</w:t>
+            </w:r>
+          </w:p>
+        </w:tc>
+        <w:tc>
+          <w:p>
+            <w:pPr>
+              <w:pStyle w:val="Normal"/>
+            </w:pPr>
+            <w:r>
+              <w:t>NA 590 (35,4%)</w:t>
             </w:r>
           </w:p>
         </w:tc>

</xml_diff>